<commit_message>
Add dedication page (manuscript + docx build)
</commit_message>
<xml_diff>
--- a/BLACK_PARAMETER.docx
+++ b/BLACK_PARAMETER.docx
@@ -49,6 +49,96 @@
           <w:szCs w:val="24"/>
         </w:rPr>
         <w:t xml:space="preserve">A Novel</w:t>
+      </w:r>
+    </w:p>
+    <w:p>
+      <w:r>
+        <w:br w:type="page"/>
+      </w:r>
+    </w:p>
+    <w:p>
+      <w:pPr>
+        <w:spacing w:after="240" w:before="4000" w:line="360"/>
+        <w:jc w:val="center"/>
+      </w:pPr>
+      <w:r>
+        <w:rPr>
+          <w:rFonts w:ascii="Georgia" w:cs="Georgia" w:eastAsia="Georgia" w:hAnsi="Georgia"/>
+          <w:i/>
+          <w:iCs/>
+          <w:color w:val="2A2A2A"/>
+          <w:sz w:val="24"/>
+          <w:szCs w:val="24"/>
+        </w:rPr>
+        <w:t xml:space="preserve">For my wife —</w:t>
+      </w:r>
+    </w:p>
+    <w:p>
+      <w:pPr>
+        <w:spacing w:after="0" w:line="360"/>
+        <w:jc w:val="center"/>
+      </w:pPr>
+      <w:r>
+        <w:rPr>
+          <w:rFonts w:ascii="Georgia" w:cs="Georgia" w:eastAsia="Georgia" w:hAnsi="Georgia"/>
+          <w:i/>
+          <w:iCs/>
+          <w:color w:val="2A2A2A"/>
+          <w:sz w:val="24"/>
+          <w:szCs w:val="24"/>
+        </w:rPr>
+        <w:t xml:space="preserve">who is the warm hands in every cold room,</w:t>
+      </w:r>
+    </w:p>
+    <w:p>
+      <w:pPr>
+        <w:spacing w:after="280" w:line="360"/>
+        <w:jc w:val="center"/>
+      </w:pPr>
+      <w:r>
+        <w:rPr>
+          <w:rFonts w:ascii="Georgia" w:cs="Georgia" w:eastAsia="Georgia" w:hAnsi="Georgia"/>
+          <w:i/>
+          <w:iCs/>
+          <w:color w:val="2A2A2A"/>
+          <w:sz w:val="24"/>
+          <w:szCs w:val="24"/>
+        </w:rPr>
+        <w:t xml:space="preserve">and the best thing that ever happened to a man who plans everything.</w:t>
+      </w:r>
+    </w:p>
+    <w:p>
+      <w:pPr>
+        <w:spacing w:after="0" w:line="360"/>
+        <w:jc w:val="center"/>
+      </w:pPr>
+      <w:r>
+        <w:rPr>
+          <w:rFonts w:ascii="Georgia" w:cs="Georgia" w:eastAsia="Georgia" w:hAnsi="Georgia"/>
+          <w:i/>
+          <w:iCs/>
+          <w:color w:val="2A2A2A"/>
+          <w:sz w:val="24"/>
+          <w:szCs w:val="24"/>
+        </w:rPr>
+        <w:t xml:space="preserve">You are the reason I take the stairs.</w:t>
+      </w:r>
+    </w:p>
+    <w:p>
+      <w:pPr>
+        <w:spacing w:after="0" w:line="360"/>
+        <w:jc w:val="center"/>
+      </w:pPr>
+      <w:r>
+        <w:rPr>
+          <w:rFonts w:ascii="Georgia" w:cs="Georgia" w:eastAsia="Georgia" w:hAnsi="Georgia"/>
+          <w:i/>
+          <w:iCs/>
+          <w:color w:val="2A2A2A"/>
+          <w:sz w:val="24"/>
+          <w:szCs w:val="24"/>
+        </w:rPr>
+        <w:t xml:space="preserve">All my love, always.</w:t>
       </w:r>
     </w:p>
     <w:p>

</xml_diff>